<commit_message>
docs: section ngrok (lien public permanent), equipe projet, auteur en page de titre
- README 3.6 : mise en place du tunnel ngrok avec domaine statique gratuit,
  methode manuelle et methode Claude Code, demarrage automatique a la session,
  limites du plan gratuit, depannage ERR_NGROK_108/334
- Documentation technique : equipe projet (A. SANOH, M. ZEKRAOUI, C. ABBADI)
- Pages de titre des deux guides Word : mention Par : Aly Aly SANOH

Co-Authored-By: Claude Fable 5 <noreply@anthropic.com>
</commit_message>
<xml_diff>
--- a/docs/DOCUMENTATION_TECHNIQUE.docx
+++ b/docs/DOCUMENTATION_TECHNIQUE.docx
@@ -48,6 +48,8 @@
         <w:t>Depot : https://github.com/alysquart/caneco-bt-tool</w:t>
         <w:br/>
         <w:t>Version : V1 - juillet 2026</w:t>
+        <w:br/>
+        <w:t>Par : Aly Aly SANOH</w:t>
       </w:r>
     </w:p>
     <w:p>
@@ -150,13 +152,13 @@
           <w:b/>
           <w:sz w:val="22"/>
         </w:rPr>
-        <w:t>Auteur initial</w:t>
+        <w:t>Équipe projet</w:t>
       </w:r>
       <w:r>
         <w:rPr>
           <w:sz w:val="22"/>
         </w:rPr>
-        <w:t xml:space="preserve"> : Aly Aly SANOH</w:t>
+        <w:t xml:space="preserve"> : Aly Aly SANOH (Stagiaire Ingénieur), Mouhcine ZEKRAOUI (Responsable Études Électrique), M. Chakib ABBADI (Chef d'Entreprise)</w:t>
       </w:r>
     </w:p>
     <w:p>

</xml_diff>

<commit_message>
docs: regle de reprise par fork uniquement, jamais de push sur le depot d'origine
Le depot alysquart/caneco-bt-tool est fige comme reference. Le repreneur
forke vers son compte, clone son fork, verifie git remote -v ; consigne
identique imposee a Claude Code dans le prompt repreneur.

Co-Authored-By: Claude Fable 5 <noreply@anthropic.com>
</commit_message>
<xml_diff>
--- a/docs/DOCUMENTATION_TECHNIQUE.docx
+++ b/docs/DOCUMENTATION_TECHNIQUE.docx
@@ -84,7 +84,7 @@
           <w:b/>
           <w:sz w:val="22"/>
         </w:rPr>
-        <w:t>Dépôt</w:t>
+        <w:t>Dépôt d'origine</w:t>
       </w:r>
       <w:r>
         <w:rPr>
@@ -104,7 +104,7 @@
         <w:rPr>
           <w:sz w:val="22"/>
         </w:rPr>
-        <w:t>)</w:t>
+        <w:t>, figé comme référence — tout repreneur travaille sur son propre fork, voir README section 1)</w:t>
       </w:r>
     </w:p>
     <w:p>

</xml_diff>